<commit_message>
Fix deliverables for final submission.
</commit_message>
<xml_diff>
--- a/submission/CyberTrace_Submission/deliverables/final_report.docx
+++ b/submission/CyberTrace_Submission/deliverables/final_report.docx
@@ -673,7 +673,7 @@
         <w:ind w:left="720"/>
       </w:pPr>
       <w:r>
-        <w:t>Set up the Python project structure and CLI workflow.</w:t>
+        <w:t>Worked jointly on the project planning, implementation, analysis, and final deliverables.</w:t>
       </w:r>
     </w:p>
     <w:p>
@@ -682,7 +682,7 @@
         <w:ind w:left="720"/>
       </w:pPr>
       <w:r>
-        <w:t>Implemented dataset preparation, clustering, tests, and packaging scripts.</w:t>
+        <w:t>Shared responsibility for the Python workflow, dataset preparation, clustering, testing, and reporting.</w:t>
       </w:r>
     </w:p>
     <w:p>
@@ -691,7 +691,7 @@
         <w:ind w:left="720"/>
       </w:pPr>
       <w:r>
-        <w:t>Integrated the real dataset analysis outputs, figures, and submission materials.</w:t>
+        <w:t>Collaborated equally on interpreting results, preparing the presentation, and packaging the submission.</w:t>
       </w:r>
     </w:p>
     <w:p>
@@ -708,7 +708,7 @@
         <w:ind w:left="720"/>
       </w:pPr>
       <w:r>
-        <w:t>Helped shape the project direction around cybersecurity investigation.</w:t>
+        <w:t>Worked jointly on the project planning, implementation, analysis, and final deliverables.</w:t>
       </w:r>
     </w:p>
     <w:p>
@@ -717,7 +717,7 @@
         <w:ind w:left="720"/>
       </w:pPr>
       <w:r>
-        <w:t>Contributed to the problem framing, motivation, and interpretation goals.</w:t>
+        <w:t>Shared responsibility for the Python workflow, dataset preparation, clustering, testing, and reporting.</w:t>
       </w:r>
     </w:p>
     <w:p>
@@ -726,12 +726,12 @@
         <w:ind w:left="720"/>
       </w:pPr>
       <w:r>
-        <w:t>Supported the final narrative about findings, implications, and future work.</w:t>
+        <w:t>Collaborated equally on interpreting results, preparing the presentation, and packaging the submission.</w:t>
       </w:r>
     </w:p>
     <w:p>
       <w:r>
-        <w:t>This section is included to make individual effort visible in the final submission instead of treating the entire project as a single anonymous artifact.</w:t>
+        <w:t>The contribution split is intentionally even. Both group members worked on the project together across planning, coding, analysis, interpretation, and final submission materials.</w:t>
       </w:r>
     </w:p>
     <w:p>

</xml_diff>